<commit_message>
feat: implement VaultBridge proof pipeline, smart contracts, and frontend application
</commit_message>
<xml_diff>
--- a/MASTER_PROJECT_DOC.docx
+++ b/MASTER_PROJECT_DOC.docx
@@ -2539,6 +2539,133 @@
     </w:p>
     <w:p>
       <w:pPr>
+        <w:pStyle w:val="Heading2"/>
+      </w:pPr>
+      <w:r>
+        <w:rPr>
+          <w:b/>
+          <w:color w:val="0D9488"/>
+          <w:sz w:val="25"/>
+        </w:rPr>
+        <w:t>Live Verified On-Chain Transactions (Ethereum Sepolia)</w:t>
+      </w:r>
+    </w:p>
+    <w:p>
+      <w:pPr>
+        <w:pStyle w:val="ListBullet"/>
+        <w:spacing w:after="60"/>
+      </w:pPr>
+      <w:r>
+        <w:rPr>
+          <w:color w:val="1E293B"/>
+        </w:rPr>
+      </w:r>
+      <w:r>
+        <w:rPr>
+          <w:b/>
+          <w:color w:val="1E293B"/>
+        </w:rPr>
+        <w:t>Invoice Issuance (`INV-SEP-001` on Block #11691999):</w:t>
+      </w:r>
+      <w:r>
+        <w:rPr>
+          <w:color w:val="1E293B"/>
+        </w:rPr>
+        <w:t xml:space="preserve"> [</w:t>
+      </w:r>
+      <w:r>
+        <w:rPr>
+          <w:rFonts w:ascii="Consolas" w:hAnsi="Consolas"/>
+          <w:color w:val="B91C1C"/>
+          <w:sz w:val="18"/>
+        </w:rPr>
+        <w:t>0xe1f5cb5a7ca82a8af42198fa747400d8f9e872b41d7d6a0883807a26de2d8a5b</w:t>
+      </w:r>
+      <w:r>
+        <w:rPr>
+          <w:color w:val="1E293B"/>
+        </w:rPr>
+        <w:t>](https://sepolia.etherscan.io/tx/0xe1f5cb5a7ca82a8af42198fa747400d8f9e872b41d7d6a0883807a26de2d8a5b)</w:t>
+      </w:r>
+    </w:p>
+    <w:p>
+      <w:pPr>
+        <w:pStyle w:val="ListBullet"/>
+        <w:spacing w:after="60"/>
+      </w:pPr>
+      <w:r>
+        <w:rPr>
+          <w:color w:val="1E293B"/>
+        </w:rPr>
+      </w:r>
+      <w:r>
+        <w:rPr>
+          <w:b/>
+          <w:color w:val="1E293B"/>
+        </w:rPr>
+        <w:t>Streak Creation (`STRK-SEP-001`):</w:t>
+      </w:r>
+      <w:r>
+        <w:rPr>
+          <w:color w:val="1E293B"/>
+        </w:rPr>
+        <w:t xml:space="preserve"> [</w:t>
+      </w:r>
+      <w:r>
+        <w:rPr>
+          <w:rFonts w:ascii="Consolas" w:hAnsi="Consolas"/>
+          <w:color w:val="B91C1C"/>
+          <w:sz w:val="18"/>
+        </w:rPr>
+        <w:t>0x7d7ce5a932be78f6ac9fedbf1ec4f9d3a9ab648fb6613a23ec159ec282d3fac2</w:t>
+      </w:r>
+      <w:r>
+        <w:rPr>
+          <w:color w:val="1E293B"/>
+        </w:rPr>
+        <w:t>](https://sepolia.etherscan.io/tx/0x7d7ce5a932be78f6ac9fedbf1ec4f9d3a9ab648fb6613a23ec159ec282d3fac2)</w:t>
+      </w:r>
+    </w:p>
+    <w:p>
+      <w:pPr>
+        <w:pStyle w:val="ListBullet"/>
+        <w:spacing w:after="60"/>
+      </w:pPr>
+      <w:r>
+        <w:rPr>
+          <w:color w:val="1E293B"/>
+        </w:rPr>
+      </w:r>
+      <w:r>
+        <w:rPr>
+          <w:b/>
+          <w:color w:val="1E293B"/>
+        </w:rPr>
+        <w:t>Streak Daily Check-In:</w:t>
+      </w:r>
+      <w:r>
+        <w:rPr>
+          <w:color w:val="1E293B"/>
+        </w:rPr>
+        <w:t xml:space="preserve"> [</w:t>
+      </w:r>
+      <w:r>
+        <w:rPr>
+          <w:rFonts w:ascii="Consolas" w:hAnsi="Consolas"/>
+          <w:color w:val="B91C1C"/>
+          <w:sz w:val="18"/>
+        </w:rPr>
+        <w:t>0x1ff751198acc721a2624b3030e4495560e2dbbacaf5618a4ee9a3033201b0c37</w:t>
+      </w:r>
+      <w:r>
+        <w:rPr>
+          <w:color w:val="1E293B"/>
+        </w:rPr>
+        <w:t>](https://sepolia.etherscan.io/tx/0x1ff751198acc721a2624b3030e4495560e2dbbacaf5618a4ee9a3033201b0c37)</w:t>
+      </w:r>
+    </w:p>
+    <w:p>
+      <w:pPr>
         <w:pStyle w:val="Heading1"/>
       </w:pPr>
       <w:r>

</xml_diff>